<commit_message>
Update app with user changes: onboarding, notifications, and UI improvements
</commit_message>
<xml_diff>
--- a/Changes for Edeen.docx
+++ b/Changes for Edeen.docx
@@ -30,40 +30,27 @@
         </w:rPr>
         <w:t>Habits</w:t>
       </w:r>
-    </w:p>
-    <w:p>
-      <w:pPr>
-        <w:numPr>
-          <w:ilvl w:val="0"/>
-          <w:numId w:val="1"/>
-        </w:numPr>
-        <w:spacing w:before="240"/>
-        <w:rPr>
-          <w:rFonts w:ascii="Calibri" w:eastAsia="Calibri" w:hAnsi="Calibri" w:cs="Calibri"/>
-        </w:rPr>
-      </w:pPr>
       <w:r>
         <w:rPr>
           <w:rFonts w:ascii="Calibri" w:eastAsia="Calibri" w:hAnsi="Calibri" w:cs="Calibri"/>
-        </w:rPr>
-        <w:t>Create a "Add New Habit" page.</w:t>
+          <w:b/>
+          <w:bCs/>
+          <w:color w:val="000000"/>
+          <w:sz w:val="26"/>
+          <w:szCs w:val="26"/>
+        </w:rPr>
+        <w:br/>
       </w:r>
-    </w:p>
-    <w:p>
-      <w:pPr>
-        <w:numPr>
-          <w:ilvl w:val="0"/>
-          <w:numId w:val="1"/>
-        </w:numPr>
-        <w:rPr>
-          <w:rFonts w:ascii="Calibri" w:eastAsia="Calibri" w:hAnsi="Calibri" w:cs="Calibri"/>
-        </w:rPr>
-      </w:pPr>
       <w:r>
         <w:rPr>
           <w:rFonts w:ascii="Calibri" w:eastAsia="Calibri" w:hAnsi="Calibri" w:cs="Calibri"/>
-        </w:rPr>
-        <w:t>Remove all habit colour options except the pastel colours.</w:t>
+          <w:b/>
+          <w:bCs/>
+          <w:color w:val="000000"/>
+          <w:sz w:val="26"/>
+          <w:szCs w:val="26"/>
+        </w:rPr>
+        <w:t>And where it is written custom, it should be written specific days of the week and then the user selects like Monday, Tuesday and all that should go for forty days  E:\edeen\src\features\home\screens\AddHabitScreen.js</w:t>
       </w:r>
     </w:p>
     <w:p>
@@ -81,21 +68,7 @@
         <w:rPr>
           <w:rFonts w:ascii="Calibri" w:eastAsia="Calibri" w:hAnsi="Calibri" w:cs="Calibri"/>
         </w:rPr>
-        <w:t xml:space="preserve">Make the frequency selection, </w:t>
-      </w:r>
-      <w:proofErr w:type="gramStart"/>
-      <w:r>
-        <w:rPr>
-          <w:rFonts w:ascii="Calibri" w:eastAsia="Calibri" w:hAnsi="Calibri" w:cs="Calibri"/>
-        </w:rPr>
-        <w:t>Add</w:t>
-      </w:r>
-      <w:proofErr w:type="gramEnd"/>
-      <w:r>
-        <w:rPr>
-          <w:rFonts w:ascii="Calibri" w:eastAsia="Calibri" w:hAnsi="Calibri" w:cs="Calibri"/>
-        </w:rPr>
-        <w:t xml:space="preserve"> an option to select a specific date for habits.</w:t>
+        <w:t>Make the frequency selection, Add an option to select a specific date for habits.</w:t>
       </w:r>
       <w:r>
         <w:rPr>
@@ -206,6 +179,89 @@
     </w:p>
     <w:p>
       <w:pPr>
+        <w:spacing w:before="240" w:after="240"/>
+        <w:rPr>
+          <w:rFonts w:ascii="Calibri" w:eastAsia="Calibri" w:hAnsi="Calibri" w:cs="Calibri"/>
+        </w:rPr>
+      </w:pPr>
+      <w:bookmarkStart w:id="2" w:name="_d308gd3i5gux" w:colFirst="0" w:colLast="0"/>
+      <w:bookmarkEnd w:id="2"/>
+    </w:p>
+    <w:p>
+      <w:pPr>
+        <w:spacing w:before="240" w:after="240"/>
+        <w:rPr>
+          <w:rFonts w:ascii="Calibri" w:eastAsia="Calibri" w:hAnsi="Calibri" w:cs="Calibri"/>
+        </w:rPr>
+      </w:pPr>
+    </w:p>
+    <w:p>
+      <w:pPr>
+        <w:spacing w:before="240" w:after="240"/>
+        <w:rPr>
+          <w:rFonts w:ascii="Calibri" w:eastAsia="Calibri" w:hAnsi="Calibri" w:cs="Calibri"/>
+        </w:rPr>
+      </w:pPr>
+      <w:r>
+        <w:rPr>
+          <w:rFonts w:ascii="Calibri" w:eastAsia="Calibri" w:hAnsi="Calibri" w:cs="Calibri"/>
+        </w:rPr>
+        <w:t xml:space="preserve">fill the progress bars with the </w:t>
+      </w:r>
+      <w:proofErr w:type="spellStart"/>
+      <w:r>
+        <w:rPr>
+          <w:rFonts w:ascii="Calibri" w:eastAsia="Calibri" w:hAnsi="Calibri" w:cs="Calibri"/>
+        </w:rPr>
+        <w:t>edeen</w:t>
+      </w:r>
+      <w:proofErr w:type="spellEnd"/>
+      <w:r>
+        <w:rPr>
+          <w:rFonts w:ascii="Calibri" w:eastAsia="Calibri" w:hAnsi="Calibri" w:cs="Calibri"/>
+        </w:rPr>
+        <w:t xml:space="preserve"> light green </w:t>
+      </w:r>
+    </w:p>
+    <w:p>
+      <w:pPr>
+        <w:spacing w:before="240" w:after="240"/>
+        <w:rPr>
+          <w:rFonts w:ascii="Calibri" w:eastAsia="Calibri" w:hAnsi="Calibri" w:cs="Calibri"/>
+        </w:rPr>
+      </w:pPr>
+    </w:p>
+    <w:p>
+      <w:pPr>
+        <w:pStyle w:val="Heading2"/>
+        <w:keepNext w:val="0"/>
+        <w:keepLines w:val="0"/>
+        <w:spacing w:after="80"/>
+        <w:rPr>
+          <w:rFonts w:ascii="Calibri" w:eastAsia="Calibri" w:hAnsi="Calibri" w:cs="Calibri"/>
+          <w:b/>
+          <w:bCs/>
+          <w:sz w:val="26"/>
+          <w:szCs w:val="26"/>
+        </w:rPr>
+      </w:pPr>
+      <w:bookmarkStart w:id="3" w:name="_whrgahono8id" w:colFirst="0" w:colLast="0"/>
+      <w:bookmarkStart w:id="4" w:name="_twrvwl7i8ejr" w:colFirst="0" w:colLast="0"/>
+      <w:bookmarkEnd w:id="3"/>
+      <w:bookmarkEnd w:id="4"/>
+      <w:r>
+        <w:rPr>
+          <w:rFonts w:ascii="Calibri" w:eastAsia="Calibri" w:hAnsi="Calibri" w:cs="Calibri"/>
+          <w:b/>
+          <w:bCs/>
+          <w:sz w:val="26"/>
+          <w:szCs w:val="26"/>
+        </w:rPr>
+        <w:t>Journal Updates</w:t>
+      </w:r>
+    </w:p>
+    <w:p>
+      <w:pPr>
         <w:pStyle w:val="Heading3"/>
         <w:keepNext w:val="0"/>
         <w:keepLines w:val="0"/>
@@ -219,8 +275,8 @@
           <w:szCs w:val="26"/>
         </w:rPr>
       </w:pPr>
-      <w:bookmarkStart w:id="2" w:name="_d308gd3i5gux" w:colFirst="0" w:colLast="0"/>
-      <w:bookmarkEnd w:id="2"/>
+      <w:bookmarkStart w:id="5" w:name="_js4987c0hfd1" w:colFirst="0" w:colLast="0"/>
+      <w:bookmarkEnd w:id="5"/>
       <w:r>
         <w:rPr>
           <w:rFonts w:ascii="Calibri" w:eastAsia="Calibri" w:hAnsi="Calibri" w:cs="Calibri"/>
@@ -230,11 +286,15 @@
           <w:sz w:val="26"/>
           <w:szCs w:val="26"/>
         </w:rPr>
-        <w:t>Trackers</w:t>
+        <w:t>Mood Section</w:t>
       </w:r>
     </w:p>
     <w:p>
       <w:pPr>
+        <w:numPr>
+          <w:ilvl w:val="0"/>
+          <w:numId w:val="7"/>
+        </w:numPr>
         <w:spacing w:before="240" w:after="240"/>
         <w:rPr>
           <w:rFonts w:ascii="Calibri" w:eastAsia="Calibri" w:hAnsi="Calibri" w:cs="Calibri"/>
@@ -244,25 +304,39 @@
         <w:rPr>
           <w:rFonts w:ascii="Calibri" w:eastAsia="Calibri" w:hAnsi="Calibri" w:cs="Calibri"/>
         </w:rPr>
-        <w:t xml:space="preserve">Remove numbering labels </w:t>
-      </w:r>
-      <w:proofErr w:type="gramStart"/>
-      <w:r>
-        <w:rPr>
-          <w:rFonts w:ascii="Calibri" w:eastAsia="Calibri" w:hAnsi="Calibri" w:cs="Calibri"/>
-        </w:rPr>
-        <w:t>such as:</w:t>
-      </w:r>
-      <w:proofErr w:type="gramEnd"/>
-      <w:r>
-        <w:rPr>
-          <w:rFonts w:ascii="Calibri" w:eastAsia="Calibri" w:hAnsi="Calibri" w:cs="Calibri"/>
-        </w:rPr>
-        <w:t>1st, 2nd, 3rd</w:t>
+        <w:t>Remove the emotion labels/words displayed underneath the "How do you feel?" section.</w:t>
       </w:r>
     </w:p>
     <w:p>
       <w:pPr>
+        <w:pStyle w:val="Heading3"/>
+        <w:keepNext w:val="0"/>
+        <w:keepLines w:val="0"/>
+        <w:spacing w:before="280"/>
+        <w:rPr>
+          <w:rFonts w:ascii="Calibri" w:eastAsia="Calibri" w:hAnsi="Calibri" w:cs="Calibri"/>
+        </w:rPr>
+      </w:pPr>
+      <w:bookmarkStart w:id="6" w:name="_pbu3sy94elcf" w:colFirst="0" w:colLast="0"/>
+      <w:bookmarkEnd w:id="6"/>
+      <w:r>
+        <w:rPr>
+          <w:rFonts w:ascii="Calibri" w:eastAsia="Calibri" w:hAnsi="Calibri" w:cs="Calibri"/>
+          <w:b/>
+          <w:bCs/>
+          <w:color w:val="000000"/>
+          <w:sz w:val="26"/>
+          <w:szCs w:val="26"/>
+        </w:rPr>
+        <w:t>Saving Entries</w:t>
+      </w:r>
+    </w:p>
+    <w:p>
+      <w:pPr>
+        <w:numPr>
+          <w:ilvl w:val="0"/>
+          <w:numId w:val="6"/>
+        </w:numPr>
         <w:spacing w:before="240" w:after="240"/>
         <w:rPr>
           <w:rFonts w:ascii="Calibri" w:eastAsia="Calibri" w:hAnsi="Calibri" w:cs="Calibri"/>
@@ -271,24 +345,179 @@
       <w:r>
         <w:rPr>
           <w:rFonts w:ascii="Calibri" w:eastAsia="Calibri" w:hAnsi="Calibri" w:cs="Calibri"/>
+        </w:rPr>
+        <w:t>Update journal colour scheme to match the colour of emotion</w:t>
+      </w:r>
+      <w:r>
+        <w:rPr>
+          <w:rFonts w:ascii="Calibri" w:eastAsia="Calibri" w:hAnsi="Calibri" w:cs="Calibri"/>
+        </w:rPr>
+        <w:br/>
+      </w:r>
+      <w:r>
+        <w:rPr>
+          <w:rFonts w:ascii="Calibri" w:eastAsia="Calibri" w:hAnsi="Calibri" w:cs="Calibri"/>
+        </w:rPr>
+        <w:br/>
+      </w:r>
+      <w:r>
+        <w:rPr>
+          <w:rFonts w:ascii="Calibri" w:eastAsia="Calibri" w:hAnsi="Calibri" w:cs="Calibri"/>
+        </w:rPr>
+        <w:br/>
+      </w:r>
+      <w:r>
+        <w:rPr>
+          <w:rFonts w:ascii="Calibri" w:eastAsia="Calibri" w:hAnsi="Calibri" w:cs="Calibri"/>
+        </w:rPr>
+        <w:br/>
+      </w:r>
+      <w:r>
+        <w:rPr>
+          <w:rFonts w:ascii="Calibri" w:eastAsia="Calibri" w:hAnsi="Calibri" w:cs="Calibri"/>
+        </w:rPr>
+        <w:br/>
+      </w:r>
+      <w:r>
+        <w:rPr>
+          <w:rFonts w:ascii="Calibri" w:eastAsia="Calibri" w:hAnsi="Calibri" w:cs="Calibri"/>
+        </w:rPr>
+        <w:br/>
+      </w:r>
+    </w:p>
+    <w:p>
+      <w:pPr>
+        <w:pStyle w:val="Heading1"/>
+        <w:rPr>
+          <w:rFonts w:ascii="Calibri" w:eastAsia="Calibri" w:hAnsi="Calibri" w:cs="Calibri"/>
+          <w:b/>
+          <w:bCs/>
+          <w:sz w:val="42"/>
+          <w:szCs w:val="42"/>
+          <w:lang w:val="en-US"/>
+        </w:rPr>
+      </w:pPr>
+      <w:r>
+        <w:rPr>
+          <w:rFonts w:ascii="Calibri" w:eastAsia="Calibri" w:hAnsi="Calibri" w:cs="Calibri"/>
+          <w:b/>
+          <w:bCs/>
+          <w:sz w:val="42"/>
+          <w:szCs w:val="42"/>
+          <w:lang w:val="en-US"/>
+        </w:rPr>
+        <w:lastRenderedPageBreak/>
+        <w:t>New Features to Add</w:t>
+      </w:r>
+    </w:p>
+    <w:p>
+      <w:pPr>
+        <w:pStyle w:val="Heading1"/>
+        <w:spacing w:before="480"/>
+        <w:rPr>
+          <w:rFonts w:ascii="Calibri" w:eastAsia="Calibri" w:hAnsi="Calibri" w:cs="Calibri"/>
+          <w:b/>
+          <w:bCs/>
+          <w:sz w:val="42"/>
+          <w:szCs w:val="42"/>
+          <w:lang w:val="en-US"/>
+        </w:rPr>
+      </w:pPr>
+      <w:r>
+        <w:rPr>
+          <w:rFonts w:ascii="Calibri" w:eastAsia="Calibri" w:hAnsi="Calibri" w:cs="Calibri"/>
+          <w:b/>
+          <w:bCs/>
+          <w:sz w:val="42"/>
+          <w:szCs w:val="42"/>
+          <w:lang w:val="en-US"/>
+        </w:rPr>
+        <w:t>Notifications</w:t>
+      </w:r>
+    </w:p>
+    <w:p>
+      <w:pPr>
+        <w:pStyle w:val="Heading1"/>
+        <w:numPr>
+          <w:ilvl w:val="0"/>
+          <w:numId w:val="11"/>
+        </w:numPr>
+        <w:spacing w:before="480"/>
+        <w:rPr>
+          <w:rFonts w:ascii="Calibri" w:eastAsia="Calibri" w:hAnsi="Calibri" w:cs="Calibri"/>
+          <w:b/>
+          <w:bCs/>
+          <w:sz w:val="42"/>
+          <w:szCs w:val="42"/>
+          <w:lang w:val="en-US"/>
+        </w:rPr>
+      </w:pPr>
+      <w:r>
+        <w:rPr>
+          <w:rFonts w:ascii="Calibri" w:eastAsia="Calibri" w:hAnsi="Calibri" w:cs="Calibri"/>
+          <w:b/>
+          <w:bCs/>
+          <w:sz w:val="42"/>
+          <w:szCs w:val="42"/>
+          <w:lang w:val="en-US"/>
+        </w:rPr>
+        <w:t>Implement push notifications for: Daily habits, Journal reminders</w:t>
+      </w:r>
+    </w:p>
+    <w:p>
+      <w:pPr>
+        <w:pStyle w:val="Heading1"/>
+        <w:keepNext w:val="0"/>
+        <w:keepLines w:val="0"/>
+        <w:spacing w:before="480"/>
+        <w:rPr>
+          <w:rFonts w:ascii="Calibri" w:eastAsia="Calibri" w:hAnsi="Calibri" w:cs="Calibri"/>
+          <w:b/>
+          <w:bCs/>
+          <w:sz w:val="42"/>
+          <w:szCs w:val="42"/>
+        </w:rPr>
+      </w:pPr>
+    </w:p>
+    <w:p>
+      <w:bookmarkStart w:id="7" w:name="_omfswpp9jvyo" w:colFirst="0" w:colLast="0"/>
+      <w:bookmarkEnd w:id="7"/>
+      <w:r>
+        <w:rPr>
+          <w:rFonts w:ascii="Calibri" w:eastAsia="Calibri" w:hAnsi="Calibri" w:cs="Calibri"/>
           <w:noProof/>
         </w:rPr>
         <w:drawing>
-          <wp:inline distT="114300" distB="114300" distL="114300" distR="114300" wp14:anchorId="71E38284" wp14:editId="4012E77B">
-            <wp:extent cx="2890838" cy="1906416"/>
-            <wp:effectExtent l="0" t="0" r="0" b="0"/>
-            <wp:docPr id="1" name="image2.png"/>
-            <wp:cNvGraphicFramePr/>
+          <wp:anchor distT="0" distB="0" distL="114300" distR="114300" simplePos="0" relativeHeight="251658240" behindDoc="0" locked="0" layoutInCell="1" allowOverlap="1" wp14:anchorId="62DEC05B" wp14:editId="005AF87B">
+            <wp:simplePos x="0" y="0"/>
+            <wp:positionH relativeFrom="margin">
+              <wp:posOffset>-38735</wp:posOffset>
+            </wp:positionH>
+            <wp:positionV relativeFrom="margin">
+              <wp:align>center</wp:align>
+            </wp:positionV>
+            <wp:extent cx="5733415" cy="2796540"/>
+            <wp:effectExtent l="0" t="0" r="635" b="3810"/>
+            <wp:wrapSquare wrapText="bothSides"/>
+            <wp:docPr id="811884566" name="Picture 1"/>
+            <wp:cNvGraphicFramePr>
+              <a:graphicFrameLocks xmlns:a="http://schemas.openxmlformats.org/drawingml/2006/main" noChangeAspect="1"/>
+            </wp:cNvGraphicFramePr>
             <a:graphic xmlns:a="http://schemas.openxmlformats.org/drawingml/2006/main">
               <a:graphicData uri="http://schemas.openxmlformats.org/drawingml/2006/picture">
                 <pic:pic xmlns:pic="http://schemas.openxmlformats.org/drawingml/2006/picture">
                   <pic:nvPicPr>
-                    <pic:cNvPr id="0" name="image2.png"/>
-                    <pic:cNvPicPr preferRelativeResize="0"/>
+                    <pic:cNvPr id="811884566" name="Picture 811884566"/>
+                    <pic:cNvPicPr/>
                   </pic:nvPicPr>
                   <pic:blipFill>
-                    <a:blip r:embed="rId6"/>
-                    <a:srcRect/>
+                    <a:blip r:embed="rId6">
+                      <a:extLst>
+                        <a:ext uri="{28A0092B-C50C-407E-A947-70E740481C1C}">
+                          <a14:useLocalDpi xmlns:a14="http://schemas.microsoft.com/office/drawing/2010/main" val="0"/>
+                        </a:ext>
+                      </a:extLst>
+                    </a:blip>
                     <a:stretch>
                       <a:fillRect/>
                     </a:stretch>
@@ -296,240 +525,25 @@
                   <pic:spPr>
                     <a:xfrm>
                       <a:off x="0" y="0"/>
-                      <a:ext cx="2890838" cy="1906416"/>
+                      <a:ext cx="5733415" cy="2796540"/>
                     </a:xfrm>
                     <a:prstGeom prst="rect">
                       <a:avLst/>
                     </a:prstGeom>
-                    <a:ln/>
                   </pic:spPr>
                 </pic:pic>
               </a:graphicData>
             </a:graphic>
-          </wp:inline>
+          </wp:anchor>
         </w:drawing>
       </w:r>
     </w:p>
+    <w:p/>
+    <w:p/>
+    <w:p/>
     <w:p>
       <w:pPr>
-        <w:spacing w:before="240" w:after="240"/>
-        <w:rPr>
-          <w:rFonts w:ascii="Calibri" w:eastAsia="Calibri" w:hAnsi="Calibri" w:cs="Calibri"/>
-        </w:rPr>
-      </w:pPr>
-    </w:p>
-    <w:p>
-      <w:pPr>
-        <w:spacing w:before="240" w:after="240"/>
-        <w:rPr>
-          <w:rFonts w:ascii="Calibri" w:eastAsia="Calibri" w:hAnsi="Calibri" w:cs="Calibri"/>
-        </w:rPr>
-      </w:pPr>
-      <w:r>
-        <w:rPr>
-          <w:rFonts w:ascii="Calibri" w:eastAsia="Calibri" w:hAnsi="Calibri" w:cs="Calibri"/>
-        </w:rPr>
-        <w:t xml:space="preserve">fill the progress bars with the </w:t>
-      </w:r>
-      <w:proofErr w:type="spellStart"/>
-      <w:r>
-        <w:rPr>
-          <w:rFonts w:ascii="Calibri" w:eastAsia="Calibri" w:hAnsi="Calibri" w:cs="Calibri"/>
-        </w:rPr>
-        <w:t>edeen</w:t>
-      </w:r>
-      <w:proofErr w:type="spellEnd"/>
-      <w:r>
-        <w:rPr>
-          <w:rFonts w:ascii="Calibri" w:eastAsia="Calibri" w:hAnsi="Calibri" w:cs="Calibri"/>
-        </w:rPr>
-        <w:t xml:space="preserve"> light green </w:t>
-      </w:r>
-    </w:p>
-    <w:p>
-      <w:pPr>
-        <w:spacing w:before="240" w:after="240"/>
-        <w:rPr>
-          <w:rFonts w:ascii="Calibri" w:eastAsia="Calibri" w:hAnsi="Calibri" w:cs="Calibri"/>
-        </w:rPr>
-      </w:pPr>
-    </w:p>
-    <w:p>
-      <w:pPr>
-        <w:pStyle w:val="Heading2"/>
-        <w:keepNext w:val="0"/>
-        <w:keepLines w:val="0"/>
-        <w:spacing w:after="80"/>
-        <w:rPr>
-          <w:rFonts w:ascii="Calibri" w:eastAsia="Calibri" w:hAnsi="Calibri" w:cs="Calibri"/>
-          <w:b/>
-          <w:bCs/>
-          <w:sz w:val="26"/>
-          <w:szCs w:val="26"/>
-        </w:rPr>
-      </w:pPr>
-      <w:bookmarkStart w:id="3" w:name="_whrgahono8id" w:colFirst="0" w:colLast="0"/>
-      <w:bookmarkStart w:id="4" w:name="_twrvwl7i8ejr" w:colFirst="0" w:colLast="0"/>
-      <w:bookmarkEnd w:id="3"/>
-      <w:bookmarkEnd w:id="4"/>
-      <w:r>
-        <w:rPr>
-          <w:rFonts w:ascii="Calibri" w:eastAsia="Calibri" w:hAnsi="Calibri" w:cs="Calibri"/>
-          <w:b/>
-          <w:bCs/>
-          <w:sz w:val="26"/>
-          <w:szCs w:val="26"/>
-        </w:rPr>
-        <w:t>Journal Updates</w:t>
-      </w:r>
-    </w:p>
-    <w:p>
-      <w:pPr>
-        <w:pStyle w:val="Heading3"/>
-        <w:keepNext w:val="0"/>
-        <w:keepLines w:val="0"/>
-        <w:spacing w:before="280"/>
-        <w:rPr>
-          <w:rFonts w:ascii="Calibri" w:eastAsia="Calibri" w:hAnsi="Calibri" w:cs="Calibri"/>
-          <w:b/>
-          <w:bCs/>
-          <w:color w:val="000000"/>
-          <w:sz w:val="26"/>
-          <w:szCs w:val="26"/>
-        </w:rPr>
-      </w:pPr>
-      <w:bookmarkStart w:id="5" w:name="_js4987c0hfd1" w:colFirst="0" w:colLast="0"/>
-      <w:bookmarkEnd w:id="5"/>
-      <w:r>
-        <w:rPr>
-          <w:rFonts w:ascii="Calibri" w:eastAsia="Calibri" w:hAnsi="Calibri" w:cs="Calibri"/>
-          <w:b/>
-          <w:bCs/>
-          <w:color w:val="000000"/>
-          <w:sz w:val="26"/>
-          <w:szCs w:val="26"/>
-        </w:rPr>
-        <w:t>Mood Section</w:t>
-      </w:r>
-    </w:p>
-    <w:p>
-      <w:pPr>
-        <w:numPr>
-          <w:ilvl w:val="0"/>
-          <w:numId w:val="7"/>
-        </w:numPr>
-        <w:spacing w:before="240" w:after="240"/>
-        <w:rPr>
-          <w:rFonts w:ascii="Calibri" w:eastAsia="Calibri" w:hAnsi="Calibri" w:cs="Calibri"/>
-        </w:rPr>
-      </w:pPr>
-      <w:r>
-        <w:rPr>
-          <w:rFonts w:ascii="Calibri" w:eastAsia="Calibri" w:hAnsi="Calibri" w:cs="Calibri"/>
-        </w:rPr>
-        <w:t>Remove the emotion labels/words displayed underneath the "How do you feel?" section.</w:t>
-      </w:r>
-    </w:p>
-    <w:p>
-      <w:pPr>
-        <w:pStyle w:val="Heading3"/>
-        <w:keepNext w:val="0"/>
-        <w:keepLines w:val="0"/>
-        <w:spacing w:before="280"/>
-        <w:rPr>
-          <w:rFonts w:ascii="Calibri" w:eastAsia="Calibri" w:hAnsi="Calibri" w:cs="Calibri"/>
-        </w:rPr>
-      </w:pPr>
-      <w:bookmarkStart w:id="6" w:name="_pbu3sy94elcf" w:colFirst="0" w:colLast="0"/>
-      <w:bookmarkEnd w:id="6"/>
-      <w:r>
-        <w:rPr>
-          <w:rFonts w:ascii="Calibri" w:eastAsia="Calibri" w:hAnsi="Calibri" w:cs="Calibri"/>
-          <w:b/>
-          <w:bCs/>
-          <w:color w:val="000000"/>
-          <w:sz w:val="26"/>
-          <w:szCs w:val="26"/>
-        </w:rPr>
-        <w:lastRenderedPageBreak/>
-        <w:t>Saving Entries</w:t>
-      </w:r>
-    </w:p>
-    <w:p>
-      <w:pPr>
-        <w:numPr>
-          <w:ilvl w:val="0"/>
-          <w:numId w:val="6"/>
-        </w:numPr>
-        <w:spacing w:before="240" w:after="240"/>
-        <w:rPr>
-          <w:rFonts w:ascii="Calibri" w:eastAsia="Calibri" w:hAnsi="Calibri" w:cs="Calibri"/>
-        </w:rPr>
-      </w:pPr>
-      <w:r>
-        <w:rPr>
-          <w:rFonts w:ascii="Calibri" w:eastAsia="Calibri" w:hAnsi="Calibri" w:cs="Calibri"/>
-        </w:rPr>
-        <w:t>Update journal colour scheme to match the colour of emotion</w:t>
-      </w:r>
-    </w:p>
-    <w:p>
-      <w:pPr>
-        <w:pStyle w:val="Heading2"/>
-        <w:keepNext w:val="0"/>
-        <w:keepLines w:val="0"/>
-        <w:spacing w:after="80"/>
-        <w:rPr>
-          <w:rFonts w:ascii="Calibri" w:eastAsia="Calibri" w:hAnsi="Calibri" w:cs="Calibri"/>
-          <w:b/>
-          <w:bCs/>
-          <w:sz w:val="34"/>
-          <w:szCs w:val="34"/>
-        </w:rPr>
-      </w:pPr>
-      <w:bookmarkStart w:id="7" w:name="_3uixi9qlejr0" w:colFirst="0" w:colLast="0"/>
-      <w:bookmarkEnd w:id="7"/>
-      <w:r>
-        <w:rPr>
-          <w:rFonts w:ascii="Calibri" w:eastAsia="Calibri" w:hAnsi="Calibri" w:cs="Calibri"/>
-          <w:b/>
-          <w:bCs/>
-          <w:sz w:val="34"/>
-          <w:szCs w:val="34"/>
-        </w:rPr>
-        <w:t>5. Dua page</w:t>
-      </w:r>
-    </w:p>
-    <w:p>
-      <w:pPr>
-        <w:numPr>
-          <w:ilvl w:val="0"/>
-          <w:numId w:val="9"/>
-        </w:numPr>
-        <w:spacing w:before="240" w:after="240"/>
-        <w:rPr>
-          <w:rFonts w:ascii="Calibri" w:eastAsia="Calibri" w:hAnsi="Calibri" w:cs="Calibri"/>
-        </w:rPr>
-      </w:pPr>
-      <w:r>
-        <w:rPr>
-          <w:rFonts w:ascii="Calibri" w:eastAsia="Calibri" w:hAnsi="Calibri" w:cs="Calibri"/>
-        </w:rPr>
-        <w:t>Spelling error on “my favourite duas”</w:t>
-      </w:r>
-    </w:p>
-    <w:p>
-      <w:pPr>
-        <w:rPr>
-          <w:rFonts w:ascii="Calibri" w:eastAsia="Calibri" w:hAnsi="Calibri" w:cs="Calibri"/>
-        </w:rPr>
-      </w:pPr>
-    </w:p>
-    <w:p>
-      <w:pPr>
         <w:pStyle w:val="Heading1"/>
-        <w:keepNext w:val="0"/>
-        <w:keepLines w:val="0"/>
         <w:spacing w:before="480"/>
         <w:rPr>
           <w:rFonts w:ascii="Calibri" w:eastAsia="Calibri" w:hAnsi="Calibri" w:cs="Calibri"/>
@@ -537,32 +551,144 @@
           <w:bCs/>
           <w:sz w:val="42"/>
           <w:szCs w:val="42"/>
-        </w:rPr>
-      </w:pPr>
-      <w:bookmarkStart w:id="8" w:name="_s7dimp3900yq" w:colFirst="0" w:colLast="0"/>
-      <w:bookmarkEnd w:id="8"/>
-    </w:p>
-    <w:p>
-      <w:pPr>
-        <w:pStyle w:val="Heading1"/>
-        <w:keepNext w:val="0"/>
-        <w:keepLines w:val="0"/>
-        <w:spacing w:before="480"/>
+          <w:lang w:val="en-US"/>
+        </w:rPr>
+      </w:pPr>
+      <w:r>
         <w:rPr>
           <w:rFonts w:ascii="Calibri" w:eastAsia="Calibri" w:hAnsi="Calibri" w:cs="Calibri"/>
           <w:b/>
           <w:bCs/>
           <w:sz w:val="42"/>
           <w:szCs w:val="42"/>
-        </w:rPr>
-      </w:pPr>
-      <w:bookmarkStart w:id="9" w:name="_1xv0hlhir1p5" w:colFirst="0" w:colLast="0"/>
-      <w:bookmarkEnd w:id="9"/>
+          <w:lang w:val="en-US"/>
+        </w:rPr>
+        <w:lastRenderedPageBreak/>
+        <w:t>App Information Pages</w:t>
+      </w:r>
     </w:p>
     <w:p>
-      <w:bookmarkStart w:id="10" w:name="_omfswpp9jvyo" w:colFirst="0" w:colLast="0"/>
-      <w:bookmarkEnd w:id="10"/>
+      <w:pPr>
+        <w:pStyle w:val="Heading1"/>
+        <w:numPr>
+          <w:ilvl w:val="0"/>
+          <w:numId w:val="12"/>
+        </w:numPr>
+        <w:spacing w:before="480"/>
+        <w:rPr>
+          <w:rFonts w:ascii="Calibri" w:eastAsia="Calibri" w:hAnsi="Calibri" w:cs="Calibri"/>
+          <w:b/>
+          <w:bCs/>
+          <w:sz w:val="42"/>
+          <w:szCs w:val="42"/>
+          <w:lang w:val="en-US"/>
+        </w:rPr>
+      </w:pPr>
+      <w:r>
+        <w:rPr>
+          <w:rFonts w:ascii="Calibri" w:eastAsia="Calibri" w:hAnsi="Calibri" w:cs="Calibri"/>
+          <w:b/>
+          <w:bCs/>
+          <w:sz w:val="42"/>
+          <w:szCs w:val="42"/>
+          <w:lang w:val="en-US"/>
+        </w:rPr>
+        <w:t>Add onboarding screens explaining:</w:t>
+      </w:r>
     </w:p>
+    <w:p>
+      <w:pPr>
+        <w:pStyle w:val="Heading1"/>
+        <w:spacing w:before="480"/>
+        <w:rPr>
+          <w:rFonts w:ascii="Calibri" w:eastAsia="Calibri" w:hAnsi="Calibri" w:cs="Calibri"/>
+          <w:b/>
+          <w:bCs/>
+          <w:sz w:val="42"/>
+          <w:szCs w:val="42"/>
+          <w:lang w:val="en-US"/>
+        </w:rPr>
+      </w:pPr>
+      <w:r>
+        <w:rPr>
+          <w:rFonts w:ascii="Calibri" w:eastAsia="Calibri" w:hAnsi="Calibri" w:cs="Calibri"/>
+          <w:b/>
+          <w:bCs/>
+          <w:sz w:val="42"/>
+          <w:szCs w:val="42"/>
+          <w:lang w:val="en-US"/>
+        </w:rPr>
+        <w:t>Purpose of the app</w:t>
+      </w:r>
+    </w:p>
+    <w:p>
+      <w:pPr>
+        <w:pStyle w:val="Heading1"/>
+        <w:spacing w:before="480"/>
+        <w:rPr>
+          <w:rFonts w:ascii="Calibri" w:eastAsia="Calibri" w:hAnsi="Calibri" w:cs="Calibri"/>
+          <w:b/>
+          <w:bCs/>
+          <w:sz w:val="42"/>
+          <w:szCs w:val="42"/>
+          <w:lang w:val="en-US"/>
+        </w:rPr>
+      </w:pPr>
+      <w:r>
+        <w:rPr>
+          <w:rFonts w:ascii="Calibri" w:eastAsia="Calibri" w:hAnsi="Calibri" w:cs="Calibri"/>
+          <w:b/>
+          <w:bCs/>
+          <w:sz w:val="42"/>
+          <w:szCs w:val="42"/>
+          <w:lang w:val="en-US"/>
+        </w:rPr>
+        <w:t>How to use each section</w:t>
+      </w:r>
+    </w:p>
+    <w:p>
+      <w:pPr>
+        <w:pStyle w:val="Heading1"/>
+        <w:spacing w:before="480"/>
+        <w:rPr>
+          <w:rFonts w:ascii="Calibri" w:eastAsia="Calibri" w:hAnsi="Calibri" w:cs="Calibri"/>
+          <w:b/>
+          <w:bCs/>
+          <w:sz w:val="42"/>
+          <w:szCs w:val="42"/>
+          <w:lang w:val="en-US"/>
+        </w:rPr>
+      </w:pPr>
+      <w:r>
+        <w:rPr>
+          <w:rFonts w:ascii="Calibri" w:eastAsia="Calibri" w:hAnsi="Calibri" w:cs="Calibri"/>
+          <w:b/>
+          <w:bCs/>
+          <w:sz w:val="42"/>
+          <w:szCs w:val="42"/>
+          <w:lang w:val="en-US"/>
+        </w:rPr>
+        <w:t>Quiz to tailor the app to the user </w:t>
+      </w:r>
+    </w:p>
+    <w:p>
+      <w:pPr>
+        <w:ind w:firstLine="720"/>
+      </w:pPr>
+    </w:p>
+    <w:p/>
+    <w:p/>
+    <w:p/>
+    <w:p/>
+    <w:p/>
+    <w:p/>
+    <w:p/>
+    <w:p/>
+    <w:p/>
+    <w:p/>
+    <w:p/>
+    <w:p/>
+    <w:p/>
     <w:sectPr>
       <w:pgSz w:w="11909" w:h="16834"/>
       <w:pgMar w:top="1440" w:right="1440" w:bottom="1440" w:left="1440" w:header="720" w:footer="720" w:gutter="0"/>
@@ -576,6 +702,155 @@
 <file path=word/numbering.xml><?xml version="1.0" encoding="utf-8"?>
 <w:numbering xmlns:wpc="http://schemas.microsoft.com/office/word/2010/wordprocessingCanvas" xmlns:cx="http://schemas.microsoft.com/office/drawing/2014/chartex" xmlns:cx1="http://schemas.microsoft.com/office/drawing/2015/9/8/chartex" xmlns:cx2="http://schemas.microsoft.com/office/drawing/2015/10/21/chartex" xmlns:cx3="http://schemas.microsoft.com/office/drawing/2016/5/9/chartex" xmlns:cx4="http://schemas.microsoft.com/office/drawing/2016/5/10/chartex" xmlns:cx5="http://schemas.microsoft.com/office/drawing/2016/5/11/chartex" xmlns:cx6="http://schemas.microsoft.com/office/drawing/2016/5/12/chartex" xmlns:cx7="http://schemas.microsoft.com/office/drawing/2016/5/13/chartex" xmlns:cx8="http://schemas.microsoft.com/office/drawing/2016/5/14/chartex" xmlns:mc="http://schemas.openxmlformats.org/markup-compatibility/2006" xmlns:aink="http://schemas.microsoft.com/office/drawing/2016/ink" xmlns:am3d="http://schemas.microsoft.com/office/drawing/2017/model3d" xmlns:o="urn:schemas-microsoft-com:office:office" xmlns:oel="http://schemas.microsoft.com/office/2019/extlst" xmlns:r="http://schemas.openxmlformats.org/officeDocument/2006/relationships" xmlns:m="http://schemas.openxmlformats.org/officeDocument/2006/math" xmlns:v="urn:schemas-microsoft-com:vml" xmlns:wp14="http://schemas.microsoft.com/office/word/2010/wordprocessingDrawing" xmlns:wp="http://schemas.openxmlformats.org/drawingml/2006/wordprocessingDrawing" xmlns:w10="urn:schemas-microsoft-com:office:word" xmlns:w="http://schemas.openxmlformats.org/wordprocessingml/2006/main" xmlns:w14="http://schemas.microsoft.com/office/word/2010/wordml" xmlns:w15="http://schemas.microsoft.com/office/word/2012/wordml" xmlns:w16cex="http://schemas.microsoft.com/office/word/2018/wordml/cex" xmlns:w16cid="http://schemas.microsoft.com/office/word/2016/wordml/cid" xmlns:w16="http://schemas.microsoft.com/office/word/2018/wordml" xmlns:w16du="http://schemas.microsoft.com/office/word/2023/wordml/word16du" xmlns:w16sdtdh="http://schemas.microsoft.com/office/word/2020/wordml/sdtdatahash" xmlns:w16sdtfl="http://schemas.microsoft.com/office/word/2024/wordml/sdtformatlock" xmlns:w16se="http://schemas.microsoft.com/office/word/2015/wordml/symex" xmlns:wpg="http://schemas.microsoft.com/office/word/2010/wordprocessingGroup" xmlns:wpi="http://schemas.microsoft.com/office/word/2010/wordprocessingInk" xmlns:wne="http://schemas.microsoft.com/office/word/2006/wordml" xmlns:wps="http://schemas.microsoft.com/office/word/2010/wordprocessingShape" mc:Ignorable="w14 w15 w16se w16cid w16 w16cex w16sdtdh w16sdtfl w16du wp14">
   <w:abstractNum w:abstractNumId="0" w15:restartNumberingAfterBreak="0">
+    <w:nsid w:val="05D85AE8"/>
+    <w:multiLevelType w:val="multilevel"/>
+    <w:tmpl w:val="915AA87A"/>
+    <w:lvl w:ilvl="0">
+      <w:start w:val="1"/>
+      <w:numFmt w:val="bullet"/>
+      <w:lvlText w:val=""/>
+      <w:lvlJc w:val="left"/>
+      <w:pPr>
+        <w:tabs>
+          <w:tab w:val="num" w:pos="720"/>
+        </w:tabs>
+        <w:ind w:left="720" w:hanging="360"/>
+      </w:pPr>
+      <w:rPr>
+        <w:rFonts w:ascii="Symbol" w:hAnsi="Symbol" w:hint="default"/>
+        <w:sz w:val="20"/>
+      </w:rPr>
+    </w:lvl>
+    <w:lvl w:ilvl="1" w:tentative="1">
+      <w:start w:val="1"/>
+      <w:numFmt w:val="bullet"/>
+      <w:lvlText w:val="o"/>
+      <w:lvlJc w:val="left"/>
+      <w:pPr>
+        <w:tabs>
+          <w:tab w:val="num" w:pos="1440"/>
+        </w:tabs>
+        <w:ind w:left="1440" w:hanging="360"/>
+      </w:pPr>
+      <w:rPr>
+        <w:rFonts w:ascii="Courier New" w:hAnsi="Courier New" w:hint="default"/>
+        <w:sz w:val="20"/>
+      </w:rPr>
+    </w:lvl>
+    <w:lvl w:ilvl="2" w:tentative="1">
+      <w:start w:val="1"/>
+      <w:numFmt w:val="bullet"/>
+      <w:lvlText w:val=""/>
+      <w:lvlJc w:val="left"/>
+      <w:pPr>
+        <w:tabs>
+          <w:tab w:val="num" w:pos="2160"/>
+        </w:tabs>
+        <w:ind w:left="2160" w:hanging="360"/>
+      </w:pPr>
+      <w:rPr>
+        <w:rFonts w:ascii="Wingdings" w:hAnsi="Wingdings" w:hint="default"/>
+        <w:sz w:val="20"/>
+      </w:rPr>
+    </w:lvl>
+    <w:lvl w:ilvl="3" w:tentative="1">
+      <w:start w:val="1"/>
+      <w:numFmt w:val="bullet"/>
+      <w:lvlText w:val=""/>
+      <w:lvlJc w:val="left"/>
+      <w:pPr>
+        <w:tabs>
+          <w:tab w:val="num" w:pos="2880"/>
+        </w:tabs>
+        <w:ind w:left="2880" w:hanging="360"/>
+      </w:pPr>
+      <w:rPr>
+        <w:rFonts w:ascii="Wingdings" w:hAnsi="Wingdings" w:hint="default"/>
+        <w:sz w:val="20"/>
+      </w:rPr>
+    </w:lvl>
+    <w:lvl w:ilvl="4" w:tentative="1">
+      <w:start w:val="1"/>
+      <w:numFmt w:val="bullet"/>
+      <w:lvlText w:val=""/>
+      <w:lvlJc w:val="left"/>
+      <w:pPr>
+        <w:tabs>
+          <w:tab w:val="num" w:pos="3600"/>
+        </w:tabs>
+        <w:ind w:left="3600" w:hanging="360"/>
+      </w:pPr>
+      <w:rPr>
+        <w:rFonts w:ascii="Wingdings" w:hAnsi="Wingdings" w:hint="default"/>
+        <w:sz w:val="20"/>
+      </w:rPr>
+    </w:lvl>
+    <w:lvl w:ilvl="5" w:tentative="1">
+      <w:start w:val="1"/>
+      <w:numFmt w:val="bullet"/>
+      <w:lvlText w:val=""/>
+      <w:lvlJc w:val="left"/>
+      <w:pPr>
+        <w:tabs>
+          <w:tab w:val="num" w:pos="4320"/>
+        </w:tabs>
+        <w:ind w:left="4320" w:hanging="360"/>
+      </w:pPr>
+      <w:rPr>
+        <w:rFonts w:ascii="Wingdings" w:hAnsi="Wingdings" w:hint="default"/>
+        <w:sz w:val="20"/>
+      </w:rPr>
+    </w:lvl>
+    <w:lvl w:ilvl="6" w:tentative="1">
+      <w:start w:val="1"/>
+      <w:numFmt w:val="bullet"/>
+      <w:lvlText w:val=""/>
+      <w:lvlJc w:val="left"/>
+      <w:pPr>
+        <w:tabs>
+          <w:tab w:val="num" w:pos="5040"/>
+        </w:tabs>
+        <w:ind w:left="5040" w:hanging="360"/>
+      </w:pPr>
+      <w:rPr>
+        <w:rFonts w:ascii="Wingdings" w:hAnsi="Wingdings" w:hint="default"/>
+        <w:sz w:val="20"/>
+      </w:rPr>
+    </w:lvl>
+    <w:lvl w:ilvl="7" w:tentative="1">
+      <w:start w:val="1"/>
+      <w:numFmt w:val="bullet"/>
+      <w:lvlText w:val=""/>
+      <w:lvlJc w:val="left"/>
+      <w:pPr>
+        <w:tabs>
+          <w:tab w:val="num" w:pos="5760"/>
+        </w:tabs>
+        <w:ind w:left="5760" w:hanging="360"/>
+      </w:pPr>
+      <w:rPr>
+        <w:rFonts w:ascii="Wingdings" w:hAnsi="Wingdings" w:hint="default"/>
+        <w:sz w:val="20"/>
+      </w:rPr>
+    </w:lvl>
+    <w:lvl w:ilvl="8" w:tentative="1">
+      <w:start w:val="1"/>
+      <w:numFmt w:val="bullet"/>
+      <w:lvlText w:val=""/>
+      <w:lvlJc w:val="left"/>
+      <w:pPr>
+        <w:tabs>
+          <w:tab w:val="num" w:pos="6480"/>
+        </w:tabs>
+        <w:ind w:left="6480" w:hanging="360"/>
+      </w:pPr>
+      <w:rPr>
+        <w:rFonts w:ascii="Wingdings" w:hAnsi="Wingdings" w:hint="default"/>
+        <w:sz w:val="20"/>
+      </w:rPr>
+    </w:lvl>
+  </w:abstractNum>
+  <w:abstractNum w:abstractNumId="1" w15:restartNumberingAfterBreak="0">
     <w:nsid w:val="0D0B17D8"/>
     <w:multiLevelType w:val="multilevel"/>
     <w:tmpl w:val="D4B6F260"/>
@@ -688,7 +963,7 @@
       </w:rPr>
     </w:lvl>
   </w:abstractNum>
-  <w:abstractNum w:abstractNumId="1" w15:restartNumberingAfterBreak="0">
+  <w:abstractNum w:abstractNumId="2" w15:restartNumberingAfterBreak="0">
     <w:nsid w:val="1B5010D4"/>
     <w:multiLevelType w:val="multilevel"/>
     <w:tmpl w:val="9F4E1F68"/>
@@ -801,7 +1076,7 @@
       </w:rPr>
     </w:lvl>
   </w:abstractNum>
-  <w:abstractNum w:abstractNumId="2" w15:restartNumberingAfterBreak="0">
+  <w:abstractNum w:abstractNumId="3" w15:restartNumberingAfterBreak="0">
     <w:nsid w:val="21B311E4"/>
     <w:multiLevelType w:val="multilevel"/>
     <w:tmpl w:val="2B466A48"/>
@@ -914,7 +1189,156 @@
       </w:rPr>
     </w:lvl>
   </w:abstractNum>
-  <w:abstractNum w:abstractNumId="3" w15:restartNumberingAfterBreak="0">
+  <w:abstractNum w:abstractNumId="4" w15:restartNumberingAfterBreak="0">
+    <w:nsid w:val="22EA2DA2"/>
+    <w:multiLevelType w:val="multilevel"/>
+    <w:tmpl w:val="A3545C3C"/>
+    <w:lvl w:ilvl="0">
+      <w:start w:val="1"/>
+      <w:numFmt w:val="bullet"/>
+      <w:lvlText w:val=""/>
+      <w:lvlJc w:val="left"/>
+      <w:pPr>
+        <w:tabs>
+          <w:tab w:val="num" w:pos="720"/>
+        </w:tabs>
+        <w:ind w:left="720" w:hanging="360"/>
+      </w:pPr>
+      <w:rPr>
+        <w:rFonts w:ascii="Symbol" w:hAnsi="Symbol" w:hint="default"/>
+        <w:sz w:val="20"/>
+      </w:rPr>
+    </w:lvl>
+    <w:lvl w:ilvl="1" w:tentative="1">
+      <w:start w:val="1"/>
+      <w:numFmt w:val="bullet"/>
+      <w:lvlText w:val="o"/>
+      <w:lvlJc w:val="left"/>
+      <w:pPr>
+        <w:tabs>
+          <w:tab w:val="num" w:pos="1440"/>
+        </w:tabs>
+        <w:ind w:left="1440" w:hanging="360"/>
+      </w:pPr>
+      <w:rPr>
+        <w:rFonts w:ascii="Courier New" w:hAnsi="Courier New" w:hint="default"/>
+        <w:sz w:val="20"/>
+      </w:rPr>
+    </w:lvl>
+    <w:lvl w:ilvl="2" w:tentative="1">
+      <w:start w:val="1"/>
+      <w:numFmt w:val="bullet"/>
+      <w:lvlText w:val=""/>
+      <w:lvlJc w:val="left"/>
+      <w:pPr>
+        <w:tabs>
+          <w:tab w:val="num" w:pos="2160"/>
+        </w:tabs>
+        <w:ind w:left="2160" w:hanging="360"/>
+      </w:pPr>
+      <w:rPr>
+        <w:rFonts w:ascii="Wingdings" w:hAnsi="Wingdings" w:hint="default"/>
+        <w:sz w:val="20"/>
+      </w:rPr>
+    </w:lvl>
+    <w:lvl w:ilvl="3" w:tentative="1">
+      <w:start w:val="1"/>
+      <w:numFmt w:val="bullet"/>
+      <w:lvlText w:val=""/>
+      <w:lvlJc w:val="left"/>
+      <w:pPr>
+        <w:tabs>
+          <w:tab w:val="num" w:pos="2880"/>
+        </w:tabs>
+        <w:ind w:left="2880" w:hanging="360"/>
+      </w:pPr>
+      <w:rPr>
+        <w:rFonts w:ascii="Wingdings" w:hAnsi="Wingdings" w:hint="default"/>
+        <w:sz w:val="20"/>
+      </w:rPr>
+    </w:lvl>
+    <w:lvl w:ilvl="4" w:tentative="1">
+      <w:start w:val="1"/>
+      <w:numFmt w:val="bullet"/>
+      <w:lvlText w:val=""/>
+      <w:lvlJc w:val="left"/>
+      <w:pPr>
+        <w:tabs>
+          <w:tab w:val="num" w:pos="3600"/>
+        </w:tabs>
+        <w:ind w:left="3600" w:hanging="360"/>
+      </w:pPr>
+      <w:rPr>
+        <w:rFonts w:ascii="Wingdings" w:hAnsi="Wingdings" w:hint="default"/>
+        <w:sz w:val="20"/>
+      </w:rPr>
+    </w:lvl>
+    <w:lvl w:ilvl="5" w:tentative="1">
+      <w:start w:val="1"/>
+      <w:numFmt w:val="bullet"/>
+      <w:lvlText w:val=""/>
+      <w:lvlJc w:val="left"/>
+      <w:pPr>
+        <w:tabs>
+          <w:tab w:val="num" w:pos="4320"/>
+        </w:tabs>
+        <w:ind w:left="4320" w:hanging="360"/>
+      </w:pPr>
+      <w:rPr>
+        <w:rFonts w:ascii="Wingdings" w:hAnsi="Wingdings" w:hint="default"/>
+        <w:sz w:val="20"/>
+      </w:rPr>
+    </w:lvl>
+    <w:lvl w:ilvl="6" w:tentative="1">
+      <w:start w:val="1"/>
+      <w:numFmt w:val="bullet"/>
+      <w:lvlText w:val=""/>
+      <w:lvlJc w:val="left"/>
+      <w:pPr>
+        <w:tabs>
+          <w:tab w:val="num" w:pos="5040"/>
+        </w:tabs>
+        <w:ind w:left="5040" w:hanging="360"/>
+      </w:pPr>
+      <w:rPr>
+        <w:rFonts w:ascii="Wingdings" w:hAnsi="Wingdings" w:hint="default"/>
+        <w:sz w:val="20"/>
+      </w:rPr>
+    </w:lvl>
+    <w:lvl w:ilvl="7" w:tentative="1">
+      <w:start w:val="1"/>
+      <w:numFmt w:val="bullet"/>
+      <w:lvlText w:val=""/>
+      <w:lvlJc w:val="left"/>
+      <w:pPr>
+        <w:tabs>
+          <w:tab w:val="num" w:pos="5760"/>
+        </w:tabs>
+        <w:ind w:left="5760" w:hanging="360"/>
+      </w:pPr>
+      <w:rPr>
+        <w:rFonts w:ascii="Wingdings" w:hAnsi="Wingdings" w:hint="default"/>
+        <w:sz w:val="20"/>
+      </w:rPr>
+    </w:lvl>
+    <w:lvl w:ilvl="8" w:tentative="1">
+      <w:start w:val="1"/>
+      <w:numFmt w:val="bullet"/>
+      <w:lvlText w:val=""/>
+      <w:lvlJc w:val="left"/>
+      <w:pPr>
+        <w:tabs>
+          <w:tab w:val="num" w:pos="6480"/>
+        </w:tabs>
+        <w:ind w:left="6480" w:hanging="360"/>
+      </w:pPr>
+      <w:rPr>
+        <w:rFonts w:ascii="Wingdings" w:hAnsi="Wingdings" w:hint="default"/>
+        <w:sz w:val="20"/>
+      </w:rPr>
+    </w:lvl>
+  </w:abstractNum>
+  <w:abstractNum w:abstractNumId="5" w15:restartNumberingAfterBreak="0">
     <w:nsid w:val="31106928"/>
     <w:multiLevelType w:val="multilevel"/>
     <w:tmpl w:val="D1EE316C"/>
@@ -1027,7 +1451,7 @@
       </w:rPr>
     </w:lvl>
   </w:abstractNum>
-  <w:abstractNum w:abstractNumId="4" w15:restartNumberingAfterBreak="0">
+  <w:abstractNum w:abstractNumId="6" w15:restartNumberingAfterBreak="0">
     <w:nsid w:val="3F265FC5"/>
     <w:multiLevelType w:val="multilevel"/>
     <w:tmpl w:val="BADACF9C"/>
@@ -1140,7 +1564,7 @@
       </w:rPr>
     </w:lvl>
   </w:abstractNum>
-  <w:abstractNum w:abstractNumId="5" w15:restartNumberingAfterBreak="0">
+  <w:abstractNum w:abstractNumId="7" w15:restartNumberingAfterBreak="0">
     <w:nsid w:val="3F735246"/>
     <w:multiLevelType w:val="multilevel"/>
     <w:tmpl w:val="62944104"/>
@@ -1253,7 +1677,7 @@
       </w:rPr>
     </w:lvl>
   </w:abstractNum>
-  <w:abstractNum w:abstractNumId="6" w15:restartNumberingAfterBreak="0">
+  <w:abstractNum w:abstractNumId="8" w15:restartNumberingAfterBreak="0">
     <w:nsid w:val="473C13E0"/>
     <w:multiLevelType w:val="multilevel"/>
     <w:tmpl w:val="3488B0A4"/>
@@ -1366,7 +1790,7 @@
       </w:rPr>
     </w:lvl>
   </w:abstractNum>
-  <w:abstractNum w:abstractNumId="7" w15:restartNumberingAfterBreak="0">
+  <w:abstractNum w:abstractNumId="9" w15:restartNumberingAfterBreak="0">
     <w:nsid w:val="50CB33CA"/>
     <w:multiLevelType w:val="multilevel"/>
     <w:tmpl w:val="06CC4442"/>
@@ -1479,7 +1903,7 @@
       </w:rPr>
     </w:lvl>
   </w:abstractNum>
-  <w:abstractNum w:abstractNumId="8" w15:restartNumberingAfterBreak="0">
+  <w:abstractNum w:abstractNumId="10" w15:restartNumberingAfterBreak="0">
     <w:nsid w:val="57F2388F"/>
     <w:multiLevelType w:val="multilevel"/>
     <w:tmpl w:val="038A37CE"/>
@@ -1592,7 +2016,7 @@
       </w:rPr>
     </w:lvl>
   </w:abstractNum>
-  <w:abstractNum w:abstractNumId="9" w15:restartNumberingAfterBreak="0">
+  <w:abstractNum w:abstractNumId="11" w15:restartNumberingAfterBreak="0">
     <w:nsid w:val="6D4C3ABE"/>
     <w:multiLevelType w:val="multilevel"/>
     <w:tmpl w:val="9AFC45D8"/>
@@ -1706,34 +2130,40 @@
     </w:lvl>
   </w:abstractNum>
   <w:num w:numId="1" w16cid:durableId="1378044133">
+    <w:abstractNumId w:val="7"/>
+  </w:num>
+  <w:num w:numId="2" w16cid:durableId="363945151">
+    <w:abstractNumId w:val="10"/>
+  </w:num>
+  <w:num w:numId="3" w16cid:durableId="575700198">
+    <w:abstractNumId w:val="3"/>
+  </w:num>
+  <w:num w:numId="4" w16cid:durableId="1985304964">
+    <w:abstractNumId w:val="9"/>
+  </w:num>
+  <w:num w:numId="5" w16cid:durableId="1294485263">
+    <w:abstractNumId w:val="6"/>
+  </w:num>
+  <w:num w:numId="6" w16cid:durableId="199899986">
+    <w:abstractNumId w:val="11"/>
+  </w:num>
+  <w:num w:numId="7" w16cid:durableId="308437615">
     <w:abstractNumId w:val="5"/>
   </w:num>
-  <w:num w:numId="2" w16cid:durableId="363945151">
+  <w:num w:numId="8" w16cid:durableId="1129007329">
+    <w:abstractNumId w:val="2"/>
+  </w:num>
+  <w:num w:numId="9" w16cid:durableId="1963462853">
     <w:abstractNumId w:val="8"/>
   </w:num>
-  <w:num w:numId="3" w16cid:durableId="575700198">
-    <w:abstractNumId w:val="2"/>
-  </w:num>
-  <w:num w:numId="4" w16cid:durableId="1985304964">
-    <w:abstractNumId w:val="7"/>
-  </w:num>
-  <w:num w:numId="5" w16cid:durableId="1294485263">
-    <w:abstractNumId w:val="4"/>
-  </w:num>
-  <w:num w:numId="6" w16cid:durableId="199899986">
-    <w:abstractNumId w:val="9"/>
-  </w:num>
-  <w:num w:numId="7" w16cid:durableId="308437615">
-    <w:abstractNumId w:val="3"/>
-  </w:num>
-  <w:num w:numId="8" w16cid:durableId="1129007329">
+  <w:num w:numId="10" w16cid:durableId="554894482">
     <w:abstractNumId w:val="1"/>
   </w:num>
-  <w:num w:numId="9" w16cid:durableId="1963462853">
-    <w:abstractNumId w:val="6"/>
+  <w:num w:numId="11" w16cid:durableId="2141915066">
+    <w:abstractNumId w:val="0"/>
   </w:num>
-  <w:num w:numId="10" w16cid:durableId="554894482">
-    <w:abstractNumId w:val="0"/>
+  <w:num w:numId="12" w16cid:durableId="1981377087">
+    <w:abstractNumId w:val="4"/>
   </w:num>
 </w:numbering>
 </file>
@@ -2252,7 +2682,6 @@
   <w:style w:type="character" w:default="1" w:styleId="DefaultParagraphFont">
     <w:name w:val="Default Paragraph Font"/>
     <w:uiPriority w:val="1"/>
-    <w:semiHidden/>
     <w:unhideWhenUsed/>
   </w:style>
   <w:style w:type="table" w:default="1" w:styleId="TableNormal">
@@ -2318,6 +2747,29 @@
       <w:color w:val="666666"/>
       <w:sz w:val="30"/>
       <w:szCs w:val="30"/>
+    </w:rPr>
+  </w:style>
+  <w:style w:type="character" w:styleId="Hyperlink">
+    <w:name w:val="Hyperlink"/>
+    <w:basedOn w:val="DefaultParagraphFont"/>
+    <w:uiPriority w:val="99"/>
+    <w:unhideWhenUsed/>
+    <w:rsid w:val="006A46C2"/>
+    <w:rPr>
+      <w:color w:val="0000FF" w:themeColor="hyperlink"/>
+      <w:u w:val="single"/>
+    </w:rPr>
+  </w:style>
+  <w:style w:type="character" w:styleId="UnresolvedMention">
+    <w:name w:val="Unresolved Mention"/>
+    <w:basedOn w:val="DefaultParagraphFont"/>
+    <w:uiPriority w:val="99"/>
+    <w:semiHidden/>
+    <w:unhideWhenUsed/>
+    <w:rsid w:val="006A46C2"/>
+    <w:rPr>
+      <w:color w:val="605E5C"/>
+      <w:shd w:val="clear" w:color="auto" w:fill="E1DFDD"/>
     </w:rPr>
   </w:style>
 </w:styles>

</xml_diff>